<commit_message>
Add GitHub links to experiment document
</commit_message>
<xml_diff>
--- a/Log-1-Context-Engineering.docx
+++ b/Log-1-Context-Engineering.docx
@@ -1199,6 +1199,154 @@
       <w:pPr>
         <w:pStyle w:val="Heading1"/>
         <w:keepNext/>
+        <w:spacing w:before="180" w:after="60"/>
+      </w:pPr>
+      <w:r>
+        <w:t>GitHub links</w:t>
+      </w:r>
+    </w:p>
+    <w:p>
+      <w:pPr>
+        <w:keepLines/>
+        <w:spacing w:after="20"/>
+      </w:pPr>
+      <w:r>
+        <w:rPr>
+          <w:rFonts w:ascii="Arial" w:hAnsi="Arial"/>
+          <w:b/>
+          <w:sz w:val="19"/>
+        </w:rPr>
+        <w:t xml:space="preserve">Repository: </w:t>
+      </w:r>
+      <w:hyperlink r:id="rId12">
+        <w:r>
+          <w:rPr>
+            <w:color w:val="000000"/>
+            <w:u w:val="single"/>
+            <w:rFonts w:ascii="Arial" w:hAnsi="Arial"/>
+            <w:sz w:val="19"/>
+          </w:rPr>
+          <w:t>https://github.com/ChrisandraVaz/context-engineering-pond-experiment</w:t>
+        </w:r>
+      </w:hyperlink>
+    </w:p>
+    <w:p>
+      <w:pPr>
+        <w:keepLines/>
+        <w:spacing w:after="20"/>
+      </w:pPr>
+      <w:r>
+        <w:rPr>
+          <w:rFonts w:ascii="Arial" w:hAnsi="Arial"/>
+          <w:b/>
+          <w:sz w:val="19"/>
+        </w:rPr>
+        <w:t xml:space="preserve">Overview: </w:t>
+      </w:r>
+      <w:hyperlink r:id="rId13">
+        <w:r>
+          <w:rPr>
+            <w:color w:val="000000"/>
+            <w:u w:val="single"/>
+            <w:rFonts w:ascii="Arial" w:hAnsi="Arial"/>
+            <w:sz w:val="19"/>
+          </w:rPr>
+          <w:t>https://chrisandravaz.github.io/context-engineering-pond-experiment/</w:t>
+        </w:r>
+      </w:hyperlink>
+    </w:p>
+    <w:p>
+      <w:pPr>
+        <w:keepLines/>
+        <w:spacing w:after="20"/>
+      </w:pPr>
+      <w:r>
+        <w:rPr>
+          <w:rFonts w:ascii="Arial" w:hAnsi="Arial"/>
+          <w:b/>
+          <w:sz w:val="19"/>
+        </w:rPr>
+        <w:t xml:space="preserve">Run 1: </w:t>
+      </w:r>
+      <w:hyperlink r:id="rId14">
+        <w:r>
+          <w:rPr>
+            <w:color w:val="000000"/>
+            <w:u w:val="single"/>
+            <w:rFonts w:ascii="Arial" w:hAnsi="Arial"/>
+            <w:sz w:val="19"/>
+          </w:rPr>
+          <w:t>https://chrisandravaz.github.io/context-engineering-pond-experiment/run-1.html</w:t>
+        </w:r>
+      </w:hyperlink>
+    </w:p>
+    <w:p>
+      <w:pPr>
+        <w:keepLines/>
+        <w:spacing w:after="20"/>
+      </w:pPr>
+      <w:r>
+        <w:rPr>
+          <w:rFonts w:ascii="Arial" w:hAnsi="Arial"/>
+          <w:b/>
+          <w:sz w:val="19"/>
+        </w:rPr>
+        <w:t xml:space="preserve">Run 2: </w:t>
+      </w:r>
+      <w:hyperlink r:id="rId15">
+        <w:r>
+          <w:rPr>
+            <w:color w:val="000000"/>
+            <w:u w:val="single"/>
+            <w:rFonts w:ascii="Arial" w:hAnsi="Arial"/>
+            <w:sz w:val="19"/>
+          </w:rPr>
+          <w:t>https://chrisandravaz.github.io/context-engineering-pond-experiment/run-2.html</w:t>
+        </w:r>
+      </w:hyperlink>
+    </w:p>
+    <w:p>
+      <w:pPr>
+        <w:keepLines/>
+        <w:spacing w:after="20"/>
+      </w:pPr>
+      <w:r>
+        <w:rPr>
+          <w:rFonts w:ascii="Arial" w:hAnsi="Arial"/>
+          <w:b/>
+          <w:sz w:val="19"/>
+        </w:rPr>
+        <w:t xml:space="preserve">Run 3: </w:t>
+      </w:r>
+      <w:hyperlink r:id="rId16">
+        <w:r>
+          <w:rPr>
+            <w:color w:val="000000"/>
+            <w:u w:val="single"/>
+            <w:rFonts w:ascii="Arial" w:hAnsi="Arial"/>
+            <w:sz w:val="19"/>
+          </w:rPr>
+          <w:t>https://chrisandravaz.github.io/context-engineering-pond-experiment/run-3.html</w:t>
+        </w:r>
+      </w:hyperlink>
+    </w:p>
+    <w:p>
+      <w:pPr>
+        <w:spacing w:before="60" w:after="0"/>
+      </w:pPr>
+      <w:r>
+        <w:rPr>
+          <w:rFonts w:ascii="Arial" w:hAnsi="Arial"/>
+          <w:i/>
+          <w:sz w:val="17"/>
+        </w:rPr>
+        <w:t>The public Pages links become active after GitHub Pages is enabled for the main branch.</w:t>
+      </w:r>
+    </w:p>
+    <w:p>
+      <w:pPr>
+        <w:pStyle w:val="Heading1"/>
+        <w:keepNext/>
         <w:pageBreakBefore/>
       </w:pPr>
       <w:r>

</xml_diff>

<commit_message>
Replace filenames with verified live links
</commit_message>
<xml_diff>
--- a/Log-1-Context-Engineering.docx
+++ b/Log-1-Context-Engineering.docx
@@ -524,11 +524,8 @@
               <w:rPr>
                 <w:rFonts w:ascii="Arial" w:hAnsi="Arial"/>
                 <w:b/>
-                <w:i w:val="0"/>
-                <w:color w:val="000000"/>
-                <w:sz w:val="20"/>
               </w:rPr>
-              <w:t>Evidence file</w:t>
+              <w:t>Hosted result</w:t>
             </w:r>
           </w:p>
         </w:tc>
@@ -618,16 +615,22 @@
             <w:vAlign w:val="center"/>
           </w:tcPr>
           <w:p>
-            <w:pPr>
-              <w:spacing w:after="40"/>
-            </w:pPr>
             <w:r>
               <w:rPr>
                 <w:rFonts w:ascii="Arial" w:hAnsi="Arial"/>
-                <w:sz w:val="18"/>
               </w:rPr>
-              <w:t>run-1-lake-pond.html</w:t>
             </w:r>
+            <w:hyperlink r:id="rId14">
+              <w:r>
+                <w:rPr>
+                  <w:rFonts w:ascii="Arial" w:hAnsi="Arial"/>
+                  <w:color w:val="000000"/>
+                  <w:u w:val="single"/>
+                  <w:sz w:val="20"/>
+                </w:rPr>
+                <w:t>Open live Run 1</w:t>
+              </w:r>
+            </w:hyperlink>
           </w:p>
         </w:tc>
       </w:tr>
@@ -716,16 +719,22 @@
             <w:vAlign w:val="center"/>
           </w:tcPr>
           <w:p>
-            <w:pPr>
-              <w:spacing w:after="40"/>
-            </w:pPr>
             <w:r>
               <w:rPr>
                 <w:rFonts w:ascii="Arial" w:hAnsi="Arial"/>
-                <w:sz w:val="18"/>
               </w:rPr>
-              <w:t>run-2-lake-pond.html</w:t>
             </w:r>
+            <w:hyperlink r:id="rId15">
+              <w:r>
+                <w:rPr>
+                  <w:rFonts w:ascii="Arial" w:hAnsi="Arial"/>
+                  <w:color w:val="000000"/>
+                  <w:u w:val="single"/>
+                  <w:sz w:val="20"/>
+                </w:rPr>
+                <w:t>Open live Run 2</w:t>
+              </w:r>
+            </w:hyperlink>
           </w:p>
         </w:tc>
       </w:tr>
@@ -814,16 +823,22 @@
             <w:vAlign w:val="center"/>
           </w:tcPr>
           <w:p>
-            <w:pPr>
-              <w:spacing w:after="40"/>
-            </w:pPr>
             <w:r>
               <w:rPr>
                 <w:rFonts w:ascii="Arial" w:hAnsi="Arial"/>
-                <w:sz w:val="18"/>
               </w:rPr>
-              <w:t>run-3-lake-pond.html</w:t>
             </w:r>
+            <w:hyperlink r:id="rId16">
+              <w:r>
+                <w:rPr>
+                  <w:rFonts w:ascii="Arial" w:hAnsi="Arial"/>
+                  <w:color w:val="000000"/>
+                  <w:u w:val="single"/>
+                  <w:sz w:val="20"/>
+                </w:rPr>
+                <w:t>Open live Run 3</w:t>
+              </w:r>
+            </w:hyperlink>
           </w:p>
         </w:tc>
       </w:tr>
@@ -1340,7 +1355,7 @@
           <w:i/>
           <w:sz w:val="17"/>
         </w:rPr>
-        <w:t>The public Pages links become active after GitHub Pages is enabled for the main branch.</w:t>
+        <w:t>All hosted links were verified live on September 11, 2026.</w:t>
       </w:r>
     </w:p>
     <w:p>

</xml_diff>

<commit_message>
Add student reflection and judgement sentences
</commit_message>
<xml_diff>
--- a/Log-1-Context-Engineering.docx
+++ b/Log-1-Context-Engineering.docx
@@ -21,22 +21,9 @@
       <w:r>
         <w:rPr>
           <w:rFonts w:ascii="Arial" w:hAnsi="Arial"/>
-          <w:b/>
-          <w:i w:val="0"/>
-          <w:color w:val="000000"/>
-          <w:sz w:val="22"/>
+          <w:sz w:val="21"/>
         </w:rPr>
-        <w:t xml:space="preserve">Name </w:t>
-      </w:r>
-      <w:r>
-        <w:rPr>
-          <w:rFonts w:ascii="Arial" w:hAnsi="Arial"/>
-          <w:b w:val="0"/>
-          <w:i w:val="0"/>
-          <w:color w:val="000000"/>
-          <w:sz w:val="22"/>
-        </w:rPr>
-        <w:t>____________________________________________________________________________</w:t>
+        <w:t>Name  Chrisandra Vaz</w:t>
       </w:r>
     </w:p>
     <w:p>
@@ -83,9 +70,9 @@
       <w:r>
         <w:rPr>
           <w:rFonts w:ascii="Arial" w:hAnsi="Arial"/>
-          <w:sz w:val="22"/>
+          <w:sz w:val="21"/>
         </w:rPr>
-        <w:t>Model used  Codex default model, unchanged across all three runs</w:t>
+        <w:t>Model used  Sol in Codex, unchanged across all three runs</w:t>
       </w:r>
     </w:p>
     <w:p>
@@ -1217,6 +1204,9 @@
         <w:spacing w:before="180" w:after="60"/>
       </w:pPr>
       <w:r>
+        <w:rPr>
+          <w:rFonts w:ascii="Arial" w:hAnsi="Arial"/>
+        </w:rPr>
         <w:t>GitHub links</w:t>
       </w:r>
     </w:p>
@@ -1428,25 +1418,82 @@
       </w:r>
     </w:p>
     <w:p>
+      <w:pPr>
+        <w:spacing w:after="120" w:line="245" w:lineRule="auto"/>
+      </w:pPr>
       <w:r>
         <w:rPr>
           <w:rFonts w:ascii="Arial" w:hAnsi="Arial"/>
+          <w:sz w:val="21"/>
         </w:rPr>
-        <w:t>I will write the required 400 to 600 word reflection here in my own words after reviewing my notes and evidence.</w:t>
+        <w:t>The initial goal of this experiment was to create a realistic version of water on a pond or lake-like surface from the top and visualize it using WebGL fragment shaders in a self-contained HTML file. I expected the added context to change how the illustration’s colours, typography, and motion differed per run. My main research question was: How does adding visual and technical context change the output of the same WebGL lake prompt?</w:t>
       </w:r>
     </w:p>
     <w:p>
+      <w:pPr>
+        <w:spacing w:after="120" w:line="245" w:lineRule="auto"/>
+      </w:pPr>
       <w:r>
         <w:rPr>
           <w:rFonts w:ascii="Arial" w:hAnsi="Arial"/>
+          <w:sz w:val="21"/>
         </w:rPr>
-        <w:t>[Type my reflection here]</w:t>
+        <w:t>I kept the three runs fair by generating them in separate, clean Codex tasks. Each untouched file was tested in the same 1280 by 720 browser view with the same click pattern. None of the runs produced a warning or console error. I also tested them with the mouse and cursor, checked whether the titles were readable, looked for grammar and legibility issues, clicked to test the ripple effect, and moved the cursor to see if that changed the water. What stayed mostly the same was the Still Water title style and the use of ripple effects, although the capitalization was not consistent. Run 1 used about eight ripple slots, while Run 3 used ten.</w:t>
+      </w:r>
+    </w:p>
+    <w:p>
+      <w:pPr>
+        <w:spacing w:after="120" w:line="245" w:lineRule="auto"/>
+      </w:pPr>
+      <w:r>
+        <w:rPr>
+          <w:rFonts w:ascii="Arial" w:hAnsi="Arial"/>
+          <w:sz w:val="21"/>
+        </w:rPr>
+        <w:t>Run 1 started with only the basic context: make a self-contained WebGL lake or pond viewed from above. Because there was almost no visual direction, the model invented a dark, realistic shoreline with bright reflections. Run 2 added much more visual language. The prompt said to make the scene calm, bright, and illustrated rather than photographic, with blue-green water, darker edges, broad cloud reflections, and drifting leaves. Those details tap into emotion, colour, and specific visual forms. You can see that this was the main differentiator between Run 1 and Run 2.</w:t>
+      </w:r>
+    </w:p>
+    <w:p>
+      <w:pPr>
+        <w:spacing w:after="120" w:line="245" w:lineRule="auto"/>
+      </w:pPr>
+      <w:r>
+        <w:rPr>
+          <w:rFonts w:ascii="Arial" w:hAnsi="Arial"/>
+          <w:sz w:val="21"/>
+        </w:rPr>
+        <w:t>Run 3 included the basic and visual context, but elevated it with much more technical detail. It requested hash randomness, value noise, fractal Brownian motion, domain warping, constant loop bounds, a device pixel ratio cap, and screen-space antialiasing. Run 2 had softer, brighter illustrated water with drifting leaves. Run 3 had a similar calm look, but to me it had more depth and looked more natural. Run 2’s repeated ripples also became stronger than expected, while Run 3 followed more of the technical requirements and produced cleaner ripples.</w:t>
+      </w:r>
+    </w:p>
+    <w:p>
+      <w:pPr>
+        <w:spacing w:after="120" w:line="245" w:lineRule="auto"/>
+      </w:pPr>
+      <w:r>
+        <w:rPr>
+          <w:rFonts w:ascii="Arial" w:hAnsi="Arial"/>
+          <w:sz w:val="21"/>
+        </w:rPr>
+        <w:t>Honestly, Run 2 caused the biggest visual turning point, which makes sense because that was where the prompt first added a real visual context layer. Looking back, though, I think the technical details also affected the appearance. You can see a shift between Run 2, which focused heavily on the visual direction, and Run 3, which kept that direction but added real technical depth. Comparing the outputs was useful because it showed me what a successful context prompt can look like when it includes a high degree of nuance in both its visual and technical details.</w:t>
+      </w:r>
+    </w:p>
+    <w:p>
+      <w:pPr>
+        <w:spacing w:after="120" w:line="245" w:lineRule="auto"/>
+      </w:pPr>
+      <w:r>
+        <w:rPr>
+          <w:rFonts w:ascii="Arial" w:hAnsi="Arial"/>
+          <w:sz w:val="21"/>
+        </w:rPr>
+        <w:t>A limitation is that each setup was tested only once, so some differences may have come from normal model variation. I used Sol in Codex for all three runs. If I did the experiment again, I would run each setup more than once and focus even more on the visual and technical depth.</w:t>
       </w:r>
     </w:p>
     <w:p>
       <w:pPr>
         <w:pStyle w:val="Heading1"/>
         <w:keepNext/>
+        <w:spacing w:before="180"/>
       </w:pPr>
       <w:r>
         <w:rPr>
@@ -1456,19 +1503,29 @@
       </w:r>
     </w:p>
     <w:p>
+      <w:pPr>
+        <w:keepLines/>
+        <w:spacing w:after="100"/>
+      </w:pPr>
       <w:r>
         <w:rPr>
           <w:rFonts w:ascii="Arial" w:hAnsi="Arial"/>
+          <w:sz w:val="21"/>
         </w:rPr>
-        <w:t>Output: __________________________________________________________________________</w:t>
+        <w:t>Output: I trust the overall result because all three files opened without console errors, and the shift from Run 1’s dark shoreline to Run 2’s brighter illustrated water and Run 3’s cleaner ripples matched the context added in each prompt.</w:t>
       </w:r>
     </w:p>
     <w:p>
+      <w:pPr>
+        <w:keepLines/>
+        <w:spacing w:after="100"/>
+      </w:pPr>
       <w:r>
         <w:rPr>
           <w:rFonts w:ascii="Arial" w:hAnsi="Arial"/>
+          <w:sz w:val="21"/>
         </w:rPr>
-        <w:t>Process: _________________________________________________________________________</w:t>
+        <w:t>Process: Using separate clean Codex tasks, the same 1280 by 720 browser view, and the same click pattern worked, but testing each setup only once made normal model variation a limitation.</w:t>
       </w:r>
     </w:p>
     <w:sectPr>

</xml_diff>

<commit_message>
Use student wording for judgement sentences
</commit_message>
<xml_diff>
--- a/Log-1-Context-Engineering.docx
+++ b/Log-1-Context-Engineering.docx
@@ -1505,27 +1505,27 @@
     <w:p>
       <w:pPr>
         <w:keepLines/>
-        <w:spacing w:after="100"/>
+        <w:spacing w:after="120"/>
       </w:pPr>
       <w:r>
         <w:rPr>
           <w:rFonts w:ascii="Arial" w:hAnsi="Arial"/>
           <w:sz w:val="21"/>
         </w:rPr>
-        <w:t>Output: I trust the overall result because all three files opened without console errors, and the shift from Run 1’s dark shoreline to Run 2’s brighter illustrated water and Run 3’s cleaner ripples matched the context added in each prompt.</w:t>
+        <w:t>Output: I trust the result because the changes accurately connected to how I wrote the context, and Run 2 honestly stands out as my favourite because the drastic difference from Run 1 made them look like two different artists from two different worlds.</w:t>
       </w:r>
     </w:p>
     <w:p>
       <w:pPr>
         <w:keepLines/>
-        <w:spacing w:after="100"/>
+        <w:spacing w:after="120"/>
       </w:pPr>
       <w:r>
         <w:rPr>
           <w:rFonts w:ascii="Arial" w:hAnsi="Arial"/>
           <w:sz w:val="21"/>
         </w:rPr>
-        <w:t>Process: Using separate clean Codex tasks, the same 1280 by 720 browser view, and the same click pattern worked, but testing each setup only once made normal model variation a limitation.</w:t>
+        <w:t>Process: What worked was keeping the test fair by using clean chats, equal browser sizes, the same expectations, and the same test actions for every run; the parts I could improve are testing each setup more than once and defining realism more consistently across the runs.</w:t>
       </w:r>
     </w:p>
     <w:sectPr>

</xml_diff>